<commit_message>
fix(md): a Markdown table's header row is a header, not bold cells
The row above a Markdown table's delimiter row was read as bold plain
cells, so HTML got <td> with every run in <b>, the bold an author typed
in a header cell was lost on the way back to Markdown, and DOCX, ODT,
RTF and LaTeX made the header bold. Header cells are now marked
style: 'header' as the other readers mark theirs, keep only the author's
own marks, and are written as <th> in <thead>, and as a repeating header
row without added bold elsewhere.
</commit_message>
<xml_diff>
--- a/test/generator/baseline/gen.md.to.docx.docx
+++ b/test/generator/baseline/gen.md.to.docx.docx
@@ -282,9 +282,6 @@
           </w:tcPr>
           <w:p>
             <w:r>
-              <w:rPr>
-                <w:b/>
-              </w:rPr>
               <w:t xml:space="preserve">ITEM</w:t>
             </w:r>
           </w:p>
@@ -295,9 +292,6 @@
           </w:tcPr>
           <w:p>
             <w:r>
-              <w:rPr>
-                <w:b/>
-              </w:rPr>
               <w:t xml:space="preserve">NEEDED</w:t>
             </w:r>
           </w:p>
@@ -446,15 +440,15 @@
         <w:gridCol w:w="1504"/>
       </w:tblGrid>
       <w:tr>
-        <w:tc>
-          <w:tcPr>
-            <w:tcW w:w="0" w:type="auto"/>
-          </w:tcPr>
-          <w:p>
-            <w:r>
-              <w:rPr>
-                <w:b/>
-              </w:rPr>
+        <w:trPr>
+          <w:tblHeader/>
+        </w:trPr>
+        <w:tc>
+          <w:tcPr>
+            <w:tcW w:w="0" w:type="auto"/>
+          </w:tcPr>
+          <w:p>
+            <w:r>
               <w:t xml:space="preserve">City or Town</w:t>
             </w:r>
           </w:p>
@@ -468,9 +462,6 @@
               <w:jc w:val="center"/>
             </w:pPr>
             <w:r>
-              <w:rPr>
-                <w:b/>
-              </w:rPr>
               <w:t xml:space="preserve">Point A</w:t>
             </w:r>
           </w:p>
@@ -484,9 +475,6 @@
               <w:jc w:val="center"/>
             </w:pPr>
             <w:r>
-              <w:rPr>
-                <w:b/>
-              </w:rPr>
               <w:t xml:space="preserve">Point B</w:t>
             </w:r>
           </w:p>
@@ -500,9 +488,6 @@
               <w:jc w:val="center"/>
             </w:pPr>
             <w:r>
-              <w:rPr>
-                <w:b/>
-              </w:rPr>
               <w:t xml:space="preserve">Point C</w:t>
             </w:r>
           </w:p>
@@ -516,9 +501,6 @@
               <w:jc w:val="center"/>
             </w:pPr>
             <w:r>
-              <w:rPr>
-                <w:b/>
-              </w:rPr>
               <w:t xml:space="preserve">Point D</w:t>
             </w:r>
           </w:p>
@@ -532,9 +514,6 @@
               <w:jc w:val="center"/>
             </w:pPr>
             <w:r>
-              <w:rPr>
-                <w:b/>
-              </w:rPr>
               <w:t xml:space="preserve">Point E</w:t>
             </w:r>
           </w:p>
@@ -890,9 +869,6 @@
           </w:tcPr>
           <w:p>
             <w:r>
-              <w:rPr>
-                <w:b/>
-              </w:rPr>
               <w:t xml:space="preserve">College</w:t>
             </w:r>
           </w:p>
@@ -903,9 +879,6 @@
           </w:tcPr>
           <w:p>
             <w:r>
-              <w:rPr>
-                <w:b/>
-              </w:rPr>
               <w:t xml:space="preserve">New students</w:t>
             </w:r>
           </w:p>
@@ -916,9 +889,6 @@
           </w:tcPr>
           <w:p>
             <w:r>
-              <w:rPr>
-                <w:b/>
-              </w:rPr>
               <w:t xml:space="preserve">Graduating students</w:t>
             </w:r>
           </w:p>
@@ -929,9 +899,6 @@
           </w:tcPr>
           <w:p>
             <w:r>
-              <w:rPr>
-                <w:b/>
-              </w:rPr>
               <w:t xml:space="preserve">Change</w:t>
             </w:r>
           </w:p>

</xml_diff>